<commit_message>
refactor(kpis): reemplazar KPI 5 de auditoria por KPI 100% de negocio (Participacion y Dependencia por Socio Comercial) y actualizar entregables docx y pptx
</commit_message>
<xml_diff>
--- a/INFORME_TECNICO_ETL_ADUANAS_CHILE.docx
+++ b/INFORME_TECNICO_ETL_ADUANAS_CHILE.docx
@@ -2472,7 +2472,7 @@
           <w:color w:val="323232"/>
           <w:sz w:val="22"/>
         </w:rPr>
-        <w:t>KPI 5: Calidad de Datos y Rendimiento del Pipeline ETL</w:t>
+        <w:t>KPI 5: Participación y Dependencia por Socio Comercial</w:t>
       </w:r>
     </w:p>
     <w:p>
@@ -2486,17 +2486,17 @@
           <w:color w:val="2D2D2D"/>
           <w:sz w:val="20"/>
         </w:rPr>
-        <w:t>• Tabla en Base de Datos: mart.kpi_05_calidad_y_eficiencia_etl</w:t>
+        <w:t>• Tabla en Base de Datos: mart.kpi_05_participacion_socios_comerciales</w:t>
         <w:br/>
-        <w:t>• Objetivo / Decisión: Monitorear la gobernanza de datos, porcentaje de nulos en origen y rendimiento operativo de las ejecuciones en Apache Airflow.</w:t>
+        <w:t>• Objetivo / Decisión: Evaluar el grado de diversificación del comercio exterior chileno y alertar sobreexposición económica con socios específicos.</w:t>
         <w:br/>
-        <w:t>• Fuente Oficial: Metadatos de Auditoría (public.etl_audit)</w:t>
+        <w:t>• Fuente Oficial: API datos.gob.cl - Aduanas (Importaciones y Exportaciones 2026)</w:t>
         <w:br/>
-        <w:t>• Periodicidad: POR EJECUCIÓN (DIARIO)</w:t>
+        <w:t>• Periodicidad: MENSUAL</w:t>
         <w:br/>
-        <w:t>• Fórmula Matemática: Tasa Retención % = (Filas Cargadas / Filas Leídas) * 100 | % Nulos Crudos.</w:t>
+        <w:t>• Fórmula Matemática: Participación % = ((FOB Export + CIF Import País) / Intercambio Total Nacional) * 100</w:t>
         <w:br/>
-        <w:t>• Meta / Umbral de Control: Tasa de Éxito &gt;= 95.0%, Porcentaje de Nulos Críticos &lt; 5.0%.</w:t>
+        <w:t>• Meta / Umbral de Control: Ningún socio comercial debe superar el 35.0% de participación nacional (Alerta de Sobreexposición).</w:t>
       </w:r>
     </w:p>
     <w:p>

</xml_diff>